<commit_message>
Add updated Assignment 2 document
Include the updated Assignment 2 DOCX submission document alongside the Verilog source, testbenches, README, screenshots, and simulation artifacts.
</commit_message>
<xml_diff>
--- a/DAY2/Assignment 2/Assignmnet 2.docx
+++ b/DAY2/Assignment 2/Assignmnet 2.docx
@@ -5,12 +5,14 @@
     <w:p>
       <w:pPr>
         <w:rPr>
-          <w:b/>
-          <w:bCs/>
-        </w:rPr>
-      </w:pPr>
-      <w:r>
-        <w:rPr>
+          <w:rFonts w:ascii="Times New Roman" w:hAnsi="Times New Roman" w:cs="Times New Roman"/>
+          <w:b/>
+          <w:bCs/>
+        </w:rPr>
+      </w:pPr>
+      <w:r>
+        <w:rPr>
+          <w:rFonts w:ascii="Times New Roman" w:hAnsi="Times New Roman" w:cs="Times New Roman"/>
           <w:b/>
           <w:bCs/>
         </w:rPr>
@@ -18,13 +20,26 @@
       </w:r>
       <w:r>
         <w:rPr>
+          <w:rFonts w:ascii="Times New Roman" w:hAnsi="Times New Roman" w:cs="Times New Roman"/>
           <w:b/>
           <w:bCs/>
         </w:rPr>
         <w:t xml:space="preserve"> 2 :</w:t>
       </w:r>
     </w:p>
-    <w:p/>
+    <w:p>
+      <w:pPr>
+        <w:rPr>
+          <w:rFonts w:ascii="Times New Roman" w:hAnsi="Times New Roman" w:cs="Times New Roman"/>
+        </w:rPr>
+      </w:pPr>
+      <w:r>
+        <w:rPr>
+          <w:rFonts w:ascii="Times New Roman" w:hAnsi="Times New Roman" w:cs="Times New Roman"/>
+        </w:rPr>
+        <w:t>GitHub Link :</w:t>
+      </w:r>
+    </w:p>
     <w:p>
       <w:pPr>
         <w:pStyle w:val="ListParagraph"/>
@@ -32,20 +47,137 @@
           <w:ilvl w:val="0"/>
           <w:numId w:val="1"/>
         </w:numPr>
-      </w:pPr>
-      <w:r>
+        <w:rPr>
+          <w:rFonts w:ascii="Times New Roman" w:hAnsi="Times New Roman" w:cs="Times New Roman"/>
+        </w:rPr>
+      </w:pPr>
+      <w:r>
+        <w:rPr>
+          <w:rFonts w:ascii="Times New Roman" w:hAnsi="Times New Roman" w:cs="Times New Roman"/>
+        </w:rPr>
+        <w:t xml:space="preserve">Link </w:t>
+      </w:r>
+      <w:r>
+        <w:rPr>
+          <w:rFonts w:ascii="Times New Roman" w:hAnsi="Times New Roman" w:cs="Times New Roman"/>
+        </w:rPr>
+        <w:t>:</w:t>
+      </w:r>
+      <w:r>
+        <w:rPr>
+          <w:rFonts w:ascii="Times New Roman" w:hAnsi="Times New Roman" w:cs="Times New Roman"/>
+        </w:rPr>
+        <w:t xml:space="preserve"> </w:t>
+      </w:r>
+      <w:hyperlink r:id="rId5" w:history="1">
+        <w:r>
+          <w:rPr>
+            <w:rStyle w:val="Hyperlink"/>
+            <w:rFonts w:ascii="Times New Roman" w:hAnsi="Times New Roman" w:cs="Times New Roman"/>
+          </w:rPr>
+          <w:t>https://github.com/ssbagi/IBM_OpenPOWER_and_SoC_Design/tree/main/DAY2/Assignment%202</w:t>
+        </w:r>
+      </w:hyperlink>
+      <w:r>
+        <w:rPr>
+          <w:rFonts w:ascii="Times New Roman" w:hAnsi="Times New Roman" w:cs="Times New Roman"/>
+        </w:rPr>
+        <w:t xml:space="preserve"> </w:t>
+      </w:r>
+    </w:p>
+    <w:p>
+      <w:pPr>
+        <w:pStyle w:val="ListParagraph"/>
+        <w:numPr>
+          <w:ilvl w:val="0"/>
+          <w:numId w:val="1"/>
+        </w:numPr>
+        <w:rPr>
+          <w:rFonts w:ascii="Times New Roman" w:hAnsi="Times New Roman" w:cs="Times New Roman"/>
+        </w:rPr>
+      </w:pPr>
+      <w:r>
+        <w:rPr>
+          <w:rFonts w:ascii="Times New Roman" w:hAnsi="Times New Roman" w:cs="Times New Roman"/>
+        </w:rPr>
+        <w:t xml:space="preserve">README.md file : </w:t>
+      </w:r>
+      <w:hyperlink r:id="rId6" w:history="1">
+        <w:r>
+          <w:rPr>
+            <w:rStyle w:val="Hyperlink"/>
+            <w:rFonts w:ascii="Times New Roman" w:hAnsi="Times New Roman" w:cs="Times New Roman"/>
+          </w:rPr>
+          <w:t>https://github.com/ssbagi/IBM_OpenPOWER_and_SoC_Design/blob/main/DAY2/Assignment%202/README.md</w:t>
+        </w:r>
+      </w:hyperlink>
+      <w:r>
+        <w:rPr>
+          <w:rFonts w:ascii="Times New Roman" w:hAnsi="Times New Roman" w:cs="Times New Roman"/>
+        </w:rPr>
+        <w:t xml:space="preserve"> </w:t>
+      </w:r>
+      <w:r>
+        <w:rPr>
+          <w:rFonts w:ascii="Times New Roman" w:hAnsi="Times New Roman" w:cs="Times New Roman"/>
+        </w:rPr>
+        <w:t xml:space="preserve"> </w:t>
+      </w:r>
+    </w:p>
+    <w:p>
+      <w:pPr>
+        <w:rPr>
+          <w:rFonts w:ascii="Times New Roman" w:hAnsi="Times New Roman" w:cs="Times New Roman"/>
+        </w:rPr>
+      </w:pPr>
+      <w:r>
+        <w:rPr>
+          <w:rFonts w:ascii="Times New Roman" w:hAnsi="Times New Roman" w:cs="Times New Roman"/>
+          <w:b/>
+          <w:bCs/>
+        </w:rPr>
+        <w:t xml:space="preserve">Question </w:t>
+      </w:r>
+      <w:r>
+        <w:rPr>
+          <w:rFonts w:ascii="Times New Roman" w:hAnsi="Times New Roman" w:cs="Times New Roman"/>
+          <w:b/>
+          <w:bCs/>
+        </w:rPr>
+        <w:t xml:space="preserve">1 </w:t>
+      </w:r>
+      <w:r>
+        <w:rPr>
+          <w:rFonts w:ascii="Times New Roman" w:hAnsi="Times New Roman" w:cs="Times New Roman"/>
+          <w:b/>
+          <w:bCs/>
+        </w:rPr>
+        <w:t>:</w:t>
+      </w:r>
+      <w:r>
+        <w:rPr>
+          <w:rFonts w:ascii="Times New Roman" w:hAnsi="Times New Roman" w:cs="Times New Roman"/>
+        </w:rPr>
+        <w:t xml:space="preserve">  </w:t>
+      </w:r>
+      <w:r>
+        <w:rPr>
+          <w:rFonts w:ascii="Times New Roman" w:hAnsi="Times New Roman" w:cs="Times New Roman"/>
+        </w:rPr>
         <w:t>Design and Simulate 8:3 Encoder. Simulate all possible input combinations and verify the output.</w:t>
       </w:r>
     </w:p>
     <w:p>
       <w:pPr>
         <w:rPr>
-          <w:b/>
-          <w:bCs/>
-        </w:rPr>
-      </w:pPr>
-      <w:r>
-        <w:rPr>
+          <w:rFonts w:ascii="Times New Roman" w:hAnsi="Times New Roman" w:cs="Times New Roman"/>
+          <w:b/>
+          <w:bCs/>
+        </w:rPr>
+      </w:pPr>
+      <w:r>
+        <w:rPr>
+          <w:rFonts w:ascii="Times New Roman" w:hAnsi="Times New Roman" w:cs="Times New Roman"/>
           <w:b/>
           <w:bCs/>
         </w:rPr>
@@ -53,123 +185,268 @@
       </w:r>
     </w:p>
     <w:p>
-      <w:r>
+      <w:pPr>
+        <w:rPr>
+          <w:rFonts w:ascii="Times New Roman" w:hAnsi="Times New Roman" w:cs="Times New Roman"/>
+        </w:rPr>
+      </w:pPr>
+      <w:r>
+        <w:rPr>
+          <w:rFonts w:ascii="Times New Roman" w:hAnsi="Times New Roman" w:cs="Times New Roman"/>
+        </w:rPr>
         <w:t>module encoder_8_to_3 (</w:t>
       </w:r>
     </w:p>
     <w:p>
-      <w:r>
+      <w:pPr>
+        <w:rPr>
+          <w:rFonts w:ascii="Times New Roman" w:hAnsi="Times New Roman" w:cs="Times New Roman"/>
+        </w:rPr>
+      </w:pPr>
+      <w:r>
+        <w:rPr>
+          <w:rFonts w:ascii="Times New Roman" w:hAnsi="Times New Roman" w:cs="Times New Roman"/>
+        </w:rPr>
         <w:t>    input  [7:0] in,</w:t>
       </w:r>
     </w:p>
     <w:p>
-      <w:r>
+      <w:pPr>
+        <w:rPr>
+          <w:rFonts w:ascii="Times New Roman" w:hAnsi="Times New Roman" w:cs="Times New Roman"/>
+        </w:rPr>
+      </w:pPr>
+      <w:r>
+        <w:rPr>
+          <w:rFonts w:ascii="Times New Roman" w:hAnsi="Times New Roman" w:cs="Times New Roman"/>
+        </w:rPr>
         <w:t>    output reg [2:0] out</w:t>
       </w:r>
     </w:p>
     <w:p>
-      <w:r>
+      <w:pPr>
+        <w:rPr>
+          <w:rFonts w:ascii="Times New Roman" w:hAnsi="Times New Roman" w:cs="Times New Roman"/>
+        </w:rPr>
+      </w:pPr>
+      <w:r>
+        <w:rPr>
+          <w:rFonts w:ascii="Times New Roman" w:hAnsi="Times New Roman" w:cs="Times New Roman"/>
+        </w:rPr>
         <w:t>);</w:t>
       </w:r>
     </w:p>
     <w:p>
-      <w:r>
+      <w:pPr>
+        <w:rPr>
+          <w:rFonts w:ascii="Times New Roman" w:hAnsi="Times New Roman" w:cs="Times New Roman"/>
+        </w:rPr>
+      </w:pPr>
+      <w:r>
+        <w:rPr>
+          <w:rFonts w:ascii="Times New Roman" w:hAnsi="Times New Roman" w:cs="Times New Roman"/>
+        </w:rPr>
         <w:t>    always @(*) begin</w:t>
       </w:r>
     </w:p>
     <w:p>
-      <w:r>
+      <w:pPr>
+        <w:rPr>
+          <w:rFonts w:ascii="Times New Roman" w:hAnsi="Times New Roman" w:cs="Times New Roman"/>
+        </w:rPr>
+      </w:pPr>
+      <w:r>
+        <w:rPr>
+          <w:rFonts w:ascii="Times New Roman" w:hAnsi="Times New Roman" w:cs="Times New Roman"/>
+        </w:rPr>
         <w:t>        case (in)</w:t>
       </w:r>
     </w:p>
     <w:p>
-      <w:r>
+      <w:pPr>
+        <w:rPr>
+          <w:rFonts w:ascii="Times New Roman" w:hAnsi="Times New Roman" w:cs="Times New Roman"/>
+        </w:rPr>
+      </w:pPr>
+      <w:r>
+        <w:rPr>
+          <w:rFonts w:ascii="Times New Roman" w:hAnsi="Times New Roman" w:cs="Times New Roman"/>
+        </w:rPr>
         <w:t>            8'b00000001: out = 3'b000;</w:t>
       </w:r>
     </w:p>
     <w:p>
-      <w:r>
+      <w:pPr>
+        <w:rPr>
+          <w:rFonts w:ascii="Times New Roman" w:hAnsi="Times New Roman" w:cs="Times New Roman"/>
+        </w:rPr>
+      </w:pPr>
+      <w:r>
+        <w:rPr>
+          <w:rFonts w:ascii="Times New Roman" w:hAnsi="Times New Roman" w:cs="Times New Roman"/>
+        </w:rPr>
         <w:t>            8'b00000010: out = 3'b001;</w:t>
       </w:r>
     </w:p>
     <w:p>
-      <w:r>
+      <w:pPr>
+        <w:rPr>
+          <w:rFonts w:ascii="Times New Roman" w:hAnsi="Times New Roman" w:cs="Times New Roman"/>
+        </w:rPr>
+      </w:pPr>
+      <w:r>
+        <w:rPr>
+          <w:rFonts w:ascii="Times New Roman" w:hAnsi="Times New Roman" w:cs="Times New Roman"/>
+        </w:rPr>
         <w:t>            8'b00000100: out = 3'b010;</w:t>
       </w:r>
     </w:p>
     <w:p>
-      <w:r>
+      <w:pPr>
+        <w:rPr>
+          <w:rFonts w:ascii="Times New Roman" w:hAnsi="Times New Roman" w:cs="Times New Roman"/>
+        </w:rPr>
+      </w:pPr>
+      <w:r>
+        <w:rPr>
+          <w:rFonts w:ascii="Times New Roman" w:hAnsi="Times New Roman" w:cs="Times New Roman"/>
+        </w:rPr>
         <w:t>            8'b00001000: out = 3'b011;</w:t>
       </w:r>
     </w:p>
     <w:p>
-      <w:r>
+      <w:pPr>
+        <w:rPr>
+          <w:rFonts w:ascii="Times New Roman" w:hAnsi="Times New Roman" w:cs="Times New Roman"/>
+        </w:rPr>
+      </w:pPr>
+      <w:r>
+        <w:rPr>
+          <w:rFonts w:ascii="Times New Roman" w:hAnsi="Times New Roman" w:cs="Times New Roman"/>
+        </w:rPr>
         <w:t>            8'b00010000: out = 3'b100;</w:t>
       </w:r>
     </w:p>
     <w:p>
-      <w:r>
+      <w:pPr>
+        <w:rPr>
+          <w:rFonts w:ascii="Times New Roman" w:hAnsi="Times New Roman" w:cs="Times New Roman"/>
+        </w:rPr>
+      </w:pPr>
+      <w:r>
+        <w:rPr>
+          <w:rFonts w:ascii="Times New Roman" w:hAnsi="Times New Roman" w:cs="Times New Roman"/>
+        </w:rPr>
         <w:t>            8'b00100000: out = 3'b101;</w:t>
       </w:r>
     </w:p>
     <w:p>
-      <w:r>
+      <w:pPr>
+        <w:rPr>
+          <w:rFonts w:ascii="Times New Roman" w:hAnsi="Times New Roman" w:cs="Times New Roman"/>
+        </w:rPr>
+      </w:pPr>
+      <w:r>
+        <w:rPr>
+          <w:rFonts w:ascii="Times New Roman" w:hAnsi="Times New Roman" w:cs="Times New Roman"/>
+        </w:rPr>
         <w:t>            8'b01000000: out = 3'b110;</w:t>
       </w:r>
     </w:p>
     <w:p>
-      <w:r>
+      <w:pPr>
+        <w:rPr>
+          <w:rFonts w:ascii="Times New Roman" w:hAnsi="Times New Roman" w:cs="Times New Roman"/>
+        </w:rPr>
+      </w:pPr>
+      <w:r>
+        <w:rPr>
+          <w:rFonts w:ascii="Times New Roman" w:hAnsi="Times New Roman" w:cs="Times New Roman"/>
+        </w:rPr>
         <w:t>            8'b10000000: out = 3'b111;</w:t>
       </w:r>
     </w:p>
     <w:p>
-      <w:r>
+      <w:pPr>
+        <w:rPr>
+          <w:rFonts w:ascii="Times New Roman" w:hAnsi="Times New Roman" w:cs="Times New Roman"/>
+        </w:rPr>
+      </w:pPr>
+      <w:r>
+        <w:rPr>
+          <w:rFonts w:ascii="Times New Roman" w:hAnsi="Times New Roman" w:cs="Times New Roman"/>
+        </w:rPr>
         <w:t>            default:     out = 3'b000;</w:t>
       </w:r>
     </w:p>
     <w:p>
-      <w:r>
+      <w:pPr>
+        <w:rPr>
+          <w:rFonts w:ascii="Times New Roman" w:hAnsi="Times New Roman" w:cs="Times New Roman"/>
+        </w:rPr>
+      </w:pPr>
+      <w:r>
+        <w:rPr>
+          <w:rFonts w:ascii="Times New Roman" w:hAnsi="Times New Roman" w:cs="Times New Roman"/>
+        </w:rPr>
         <w:t>        endcase</w:t>
       </w:r>
     </w:p>
     <w:p>
-      <w:r>
+      <w:pPr>
+        <w:rPr>
+          <w:rFonts w:ascii="Times New Roman" w:hAnsi="Times New Roman" w:cs="Times New Roman"/>
+        </w:rPr>
+      </w:pPr>
+      <w:r>
+        <w:rPr>
+          <w:rFonts w:ascii="Times New Roman" w:hAnsi="Times New Roman" w:cs="Times New Roman"/>
+        </w:rPr>
         <w:t>    end</w:t>
       </w:r>
     </w:p>
     <w:p>
-      <w:r>
+      <w:pPr>
+        <w:rPr>
+          <w:rFonts w:ascii="Times New Roman" w:hAnsi="Times New Roman" w:cs="Times New Roman"/>
+        </w:rPr>
+      </w:pPr>
+      <w:r>
+        <w:rPr>
+          <w:rFonts w:ascii="Times New Roman" w:hAnsi="Times New Roman" w:cs="Times New Roman"/>
+        </w:rPr>
         <w:t>endmodule</w:t>
       </w:r>
     </w:p>
-    <w:p/>
-    <w:p/>
-    <w:p/>
-    <w:p>
-      <w:pPr>
-        <w:rPr>
-          <w:b/>
-          <w:bCs/>
-        </w:rPr>
-      </w:pPr>
-    </w:p>
-    <w:p>
-      <w:pPr>
-        <w:rPr>
-          <w:b/>
-          <w:bCs/>
-        </w:rPr>
-      </w:pPr>
-    </w:p>
-    <w:p>
-      <w:pPr>
-        <w:rPr>
-          <w:b/>
-          <w:bCs/>
-        </w:rPr>
-      </w:pPr>
-      <w:r>
-        <w:rPr>
+    <w:p>
+      <w:pPr>
+        <w:rPr>
+          <w:rFonts w:ascii="Times New Roman" w:hAnsi="Times New Roman" w:cs="Times New Roman"/>
+          <w:b/>
+          <w:bCs/>
+        </w:rPr>
+      </w:pPr>
+    </w:p>
+    <w:p>
+      <w:pPr>
+        <w:rPr>
+          <w:rFonts w:ascii="Times New Roman" w:hAnsi="Times New Roman" w:cs="Times New Roman"/>
+          <w:b/>
+          <w:bCs/>
+        </w:rPr>
+      </w:pPr>
+    </w:p>
+    <w:p>
+      <w:pPr>
+        <w:rPr>
+          <w:rFonts w:ascii="Times New Roman" w:hAnsi="Times New Roman" w:cs="Times New Roman"/>
+          <w:b/>
+          <w:bCs/>
+        </w:rPr>
+      </w:pPr>
+      <w:r>
+        <w:rPr>
+          <w:rFonts w:ascii="Times New Roman" w:hAnsi="Times New Roman" w:cs="Times New Roman"/>
           <w:b/>
           <w:bCs/>
         </w:rPr>
@@ -178,7 +455,15 @@
       </w:r>
     </w:p>
     <w:p>
-      <w:r>
+      <w:pPr>
+        <w:rPr>
+          <w:rFonts w:ascii="Times New Roman" w:hAnsi="Times New Roman" w:cs="Times New Roman"/>
+        </w:rPr>
+      </w:pPr>
+      <w:r>
+        <w:rPr>
+          <w:rFonts w:ascii="Times New Roman" w:hAnsi="Times New Roman" w:cs="Times New Roman"/>
+        </w:rPr>
         <w:drawing>
           <wp:inline distT="0" distB="0" distL="0" distR="0" wp14:anchorId="10144E94" wp14:editId="2184882F">
             <wp:extent cx="5731510" cy="3034665"/>
@@ -195,7 +480,7 @@
                     <pic:cNvPicPr/>
                   </pic:nvPicPr>
                   <pic:blipFill>
-                    <a:blip r:embed="rId5"/>
+                    <a:blip r:embed="rId7"/>
                     <a:stretch>
                       <a:fillRect/>
                     </a:stretch>
@@ -216,16 +501,24 @@
         </w:drawing>
       </w:r>
     </w:p>
-    <w:p/>
-    <w:p>
-      <w:pPr>
-        <w:rPr>
-          <w:b/>
-          <w:bCs/>
-        </w:rPr>
-      </w:pPr>
-      <w:r>
-        <w:rPr>
+    <w:p>
+      <w:pPr>
+        <w:rPr>
+          <w:rFonts w:ascii="Times New Roman" w:hAnsi="Times New Roman" w:cs="Times New Roman"/>
+        </w:rPr>
+      </w:pPr>
+    </w:p>
+    <w:p>
+      <w:pPr>
+        <w:rPr>
+          <w:rFonts w:ascii="Times New Roman" w:hAnsi="Times New Roman" w:cs="Times New Roman"/>
+          <w:b/>
+          <w:bCs/>
+        </w:rPr>
+      </w:pPr>
+      <w:r>
+        <w:rPr>
+          <w:rFonts w:ascii="Times New Roman" w:hAnsi="Times New Roman" w:cs="Times New Roman"/>
           <w:b/>
           <w:bCs/>
         </w:rPr>
@@ -233,6 +526,7 @@
       </w:r>
       <w:r>
         <w:rPr>
+          <w:rFonts w:ascii="Times New Roman" w:hAnsi="Times New Roman" w:cs="Times New Roman"/>
           <w:b/>
           <w:bCs/>
         </w:rPr>
@@ -240,12 +534,28 @@
       </w:r>
     </w:p>
     <w:p>
-      <w:r>
+      <w:pPr>
+        <w:rPr>
+          <w:rFonts w:ascii="Times New Roman" w:hAnsi="Times New Roman" w:cs="Times New Roman"/>
+        </w:rPr>
+      </w:pPr>
+      <w:r>
+        <w:rPr>
+          <w:rFonts w:ascii="Times New Roman" w:hAnsi="Times New Roman" w:cs="Times New Roman"/>
+        </w:rPr>
         <w:t>The Input values shown are in the Hexadecimal. The output selection is based on the inputs and stuff.</w:t>
       </w:r>
     </w:p>
     <w:p>
-      <w:r>
+      <w:pPr>
+        <w:rPr>
+          <w:rFonts w:ascii="Times New Roman" w:hAnsi="Times New Roman" w:cs="Times New Roman"/>
+        </w:rPr>
+      </w:pPr>
+      <w:r>
+        <w:rPr>
+          <w:rFonts w:ascii="Times New Roman" w:hAnsi="Times New Roman" w:cs="Times New Roman"/>
+        </w:rPr>
         <w:drawing>
           <wp:inline distT="0" distB="0" distL="0" distR="0" wp14:anchorId="5A2EF5FA" wp14:editId="3ED00561">
             <wp:extent cx="5731510" cy="3220085"/>
@@ -262,7 +572,7 @@
                     <pic:cNvPicPr/>
                   </pic:nvPicPr>
                   <pic:blipFill>
-                    <a:blip r:embed="rId6"/>
+                    <a:blip r:embed="rId8"/>
                     <a:stretch>
                       <a:fillRect/>
                     </a:stretch>
@@ -283,12 +593,1303 @@
         </w:drawing>
       </w:r>
     </w:p>
-    <w:p/>
-    <w:p/>
-    <w:p/>
-    <w:p/>
-    <w:p/>
-    <w:p/>
+    <w:p>
+      <w:pPr>
+        <w:rPr>
+          <w:rFonts w:ascii="Times New Roman" w:hAnsi="Times New Roman" w:cs="Times New Roman"/>
+        </w:rPr>
+      </w:pPr>
+    </w:p>
+    <w:p>
+      <w:pPr>
+        <w:rPr>
+          <w:rFonts w:ascii="Times New Roman" w:hAnsi="Times New Roman" w:cs="Times New Roman"/>
+        </w:rPr>
+      </w:pPr>
+    </w:p>
+    <w:p>
+      <w:pPr>
+        <w:rPr>
+          <w:rFonts w:ascii="Times New Roman" w:hAnsi="Times New Roman" w:cs="Times New Roman"/>
+        </w:rPr>
+      </w:pPr>
+    </w:p>
+    <w:p>
+      <w:pPr>
+        <w:rPr>
+          <w:rFonts w:ascii="Times New Roman" w:hAnsi="Times New Roman" w:cs="Times New Roman"/>
+        </w:rPr>
+      </w:pPr>
+      <w:r>
+        <w:rPr>
+          <w:rFonts w:ascii="Times New Roman" w:hAnsi="Times New Roman" w:cs="Times New Roman"/>
+          <w:b/>
+          <w:bCs/>
+        </w:rPr>
+        <w:lastRenderedPageBreak/>
+        <w:t xml:space="preserve">Question </w:t>
+      </w:r>
+      <w:r>
+        <w:rPr>
+          <w:rFonts w:ascii="Times New Roman" w:hAnsi="Times New Roman" w:cs="Times New Roman"/>
+          <w:b/>
+          <w:bCs/>
+        </w:rPr>
+        <w:t>2</w:t>
+      </w:r>
+      <w:r>
+        <w:rPr>
+          <w:rFonts w:ascii="Times New Roman" w:hAnsi="Times New Roman" w:cs="Times New Roman"/>
+          <w:b/>
+          <w:bCs/>
+        </w:rPr>
+        <w:t xml:space="preserve"> :</w:t>
+      </w:r>
+      <w:r>
+        <w:rPr>
+          <w:rFonts w:ascii="Times New Roman" w:hAnsi="Times New Roman" w:cs="Times New Roman"/>
+        </w:rPr>
+        <w:t xml:space="preserve">  </w:t>
+      </w:r>
+    </w:p>
+    <w:p>
+      <w:pPr>
+        <w:rPr>
+          <w:rFonts w:ascii="Times New Roman" w:hAnsi="Times New Roman" w:cs="Times New Roman"/>
+        </w:rPr>
+      </w:pPr>
+      <w:r>
+        <w:rPr>
+          <w:rFonts w:ascii="Times New Roman" w:hAnsi="Times New Roman" w:cs="Times New Roman"/>
+        </w:rPr>
+        <w:t xml:space="preserve">Design and simulate 4-bit magnitude comparator that generates outputs indicating: </w:t>
+      </w:r>
+    </w:p>
+    <w:p>
+      <w:pPr>
+        <w:rPr>
+          <w:rFonts w:ascii="Times New Roman" w:hAnsi="Times New Roman" w:cs="Times New Roman"/>
+        </w:rPr>
+      </w:pPr>
+      <w:r>
+        <w:rPr>
+          <w:rFonts w:ascii="Times New Roman" w:hAnsi="Times New Roman" w:cs="Times New Roman"/>
+        </w:rPr>
+        <w:t xml:space="preserve">• A &gt; B </w:t>
+      </w:r>
+    </w:p>
+    <w:p>
+      <w:pPr>
+        <w:rPr>
+          <w:rFonts w:ascii="Times New Roman" w:hAnsi="Times New Roman" w:cs="Times New Roman"/>
+        </w:rPr>
+      </w:pPr>
+      <w:r>
+        <w:rPr>
+          <w:rFonts w:ascii="Times New Roman" w:hAnsi="Times New Roman" w:cs="Times New Roman"/>
+        </w:rPr>
+        <w:t xml:space="preserve">• A = B </w:t>
+      </w:r>
+    </w:p>
+    <w:p>
+      <w:pPr>
+        <w:rPr>
+          <w:rFonts w:ascii="Times New Roman" w:hAnsi="Times New Roman" w:cs="Times New Roman"/>
+        </w:rPr>
+      </w:pPr>
+      <w:r>
+        <w:rPr>
+          <w:rFonts w:ascii="Times New Roman" w:hAnsi="Times New Roman" w:cs="Times New Roman"/>
+        </w:rPr>
+        <w:t>• A &lt; B</w:t>
+      </w:r>
+    </w:p>
+    <w:p>
+      <w:pPr>
+        <w:rPr>
+          <w:rFonts w:ascii="Times New Roman" w:hAnsi="Times New Roman" w:cs="Times New Roman"/>
+        </w:rPr>
+      </w:pPr>
+    </w:p>
+    <w:p>
+      <w:pPr>
+        <w:rPr>
+          <w:rFonts w:ascii="Times New Roman" w:hAnsi="Times New Roman" w:cs="Times New Roman"/>
+          <w:b/>
+          <w:bCs/>
+        </w:rPr>
+      </w:pPr>
+      <w:r>
+        <w:rPr>
+          <w:rFonts w:ascii="Times New Roman" w:hAnsi="Times New Roman" w:cs="Times New Roman"/>
+          <w:b/>
+          <w:bCs/>
+        </w:rPr>
+        <w:t>Verilog code :</w:t>
+      </w:r>
+    </w:p>
+    <w:p>
+      <w:pPr>
+        <w:rPr>
+          <w:rFonts w:ascii="Times New Roman" w:hAnsi="Times New Roman" w:cs="Times New Roman"/>
+        </w:rPr>
+      </w:pPr>
+      <w:r>
+        <w:rPr>
+          <w:rFonts w:ascii="Times New Roman" w:hAnsi="Times New Roman" w:cs="Times New Roman"/>
+        </w:rPr>
+        <w:t>module comparator_4bit (</w:t>
+      </w:r>
+    </w:p>
+    <w:p>
+      <w:pPr>
+        <w:rPr>
+          <w:rFonts w:ascii="Times New Roman" w:hAnsi="Times New Roman" w:cs="Times New Roman"/>
+        </w:rPr>
+      </w:pPr>
+      <w:r>
+        <w:rPr>
+          <w:rFonts w:ascii="Times New Roman" w:hAnsi="Times New Roman" w:cs="Times New Roman"/>
+        </w:rPr>
+        <w:t>    input  [3:0] a,</w:t>
+      </w:r>
+    </w:p>
+    <w:p>
+      <w:pPr>
+        <w:rPr>
+          <w:rFonts w:ascii="Times New Roman" w:hAnsi="Times New Roman" w:cs="Times New Roman"/>
+        </w:rPr>
+      </w:pPr>
+      <w:r>
+        <w:rPr>
+          <w:rFonts w:ascii="Times New Roman" w:hAnsi="Times New Roman" w:cs="Times New Roman"/>
+        </w:rPr>
+        <w:t>    input  [3:0] b,</w:t>
+      </w:r>
+    </w:p>
+    <w:p>
+      <w:pPr>
+        <w:rPr>
+          <w:rFonts w:ascii="Times New Roman" w:hAnsi="Times New Roman" w:cs="Times New Roman"/>
+        </w:rPr>
+      </w:pPr>
+      <w:r>
+        <w:rPr>
+          <w:rFonts w:ascii="Times New Roman" w:hAnsi="Times New Roman" w:cs="Times New Roman"/>
+        </w:rPr>
+        <w:t>    output reg  a_greater,</w:t>
+      </w:r>
+    </w:p>
+    <w:p>
+      <w:pPr>
+        <w:rPr>
+          <w:rFonts w:ascii="Times New Roman" w:hAnsi="Times New Roman" w:cs="Times New Roman"/>
+        </w:rPr>
+      </w:pPr>
+      <w:r>
+        <w:rPr>
+          <w:rFonts w:ascii="Times New Roman" w:hAnsi="Times New Roman" w:cs="Times New Roman"/>
+        </w:rPr>
+        <w:t>    output reg  b_greater,</w:t>
+      </w:r>
+    </w:p>
+    <w:p>
+      <w:pPr>
+        <w:rPr>
+          <w:rFonts w:ascii="Times New Roman" w:hAnsi="Times New Roman" w:cs="Times New Roman"/>
+        </w:rPr>
+      </w:pPr>
+      <w:r>
+        <w:rPr>
+          <w:rFonts w:ascii="Times New Roman" w:hAnsi="Times New Roman" w:cs="Times New Roman"/>
+        </w:rPr>
+        <w:t>    output reg  equal</w:t>
+      </w:r>
+    </w:p>
+    <w:p>
+      <w:pPr>
+        <w:rPr>
+          <w:rFonts w:ascii="Times New Roman" w:hAnsi="Times New Roman" w:cs="Times New Roman"/>
+        </w:rPr>
+      </w:pPr>
+      <w:r>
+        <w:rPr>
+          <w:rFonts w:ascii="Times New Roman" w:hAnsi="Times New Roman" w:cs="Times New Roman"/>
+        </w:rPr>
+        <w:t>);</w:t>
+      </w:r>
+    </w:p>
+    <w:p>
+      <w:pPr>
+        <w:rPr>
+          <w:rFonts w:ascii="Times New Roman" w:hAnsi="Times New Roman" w:cs="Times New Roman"/>
+        </w:rPr>
+      </w:pPr>
+    </w:p>
+    <w:p>
+      <w:pPr>
+        <w:rPr>
+          <w:rFonts w:ascii="Times New Roman" w:hAnsi="Times New Roman" w:cs="Times New Roman"/>
+        </w:rPr>
+      </w:pPr>
+      <w:r>
+        <w:rPr>
+          <w:rFonts w:ascii="Times New Roman" w:hAnsi="Times New Roman" w:cs="Times New Roman"/>
+        </w:rPr>
+        <w:t>    always @(*) begin</w:t>
+      </w:r>
+    </w:p>
+    <w:p>
+      <w:pPr>
+        <w:rPr>
+          <w:rFonts w:ascii="Times New Roman" w:hAnsi="Times New Roman" w:cs="Times New Roman"/>
+        </w:rPr>
+      </w:pPr>
+      <w:r>
+        <w:rPr>
+          <w:rFonts w:ascii="Times New Roman" w:hAnsi="Times New Roman" w:cs="Times New Roman"/>
+        </w:rPr>
+        <w:t>        a_greater = 1'b0;</w:t>
+      </w:r>
+    </w:p>
+    <w:p>
+      <w:pPr>
+        <w:rPr>
+          <w:rFonts w:ascii="Times New Roman" w:hAnsi="Times New Roman" w:cs="Times New Roman"/>
+        </w:rPr>
+      </w:pPr>
+      <w:r>
+        <w:rPr>
+          <w:rFonts w:ascii="Times New Roman" w:hAnsi="Times New Roman" w:cs="Times New Roman"/>
+        </w:rPr>
+        <w:t>        b_greater = 1'b0;</w:t>
+      </w:r>
+    </w:p>
+    <w:p>
+      <w:pPr>
+        <w:rPr>
+          <w:rFonts w:ascii="Times New Roman" w:hAnsi="Times New Roman" w:cs="Times New Roman"/>
+        </w:rPr>
+      </w:pPr>
+      <w:r>
+        <w:rPr>
+          <w:rFonts w:ascii="Times New Roman" w:hAnsi="Times New Roman" w:cs="Times New Roman"/>
+        </w:rPr>
+        <w:t>        equal = 1'b0;</w:t>
+      </w:r>
+    </w:p>
+    <w:p>
+      <w:pPr>
+        <w:rPr>
+          <w:rFonts w:ascii="Times New Roman" w:hAnsi="Times New Roman" w:cs="Times New Roman"/>
+        </w:rPr>
+      </w:pPr>
+    </w:p>
+    <w:p>
+      <w:pPr>
+        <w:rPr>
+          <w:rFonts w:ascii="Times New Roman" w:hAnsi="Times New Roman" w:cs="Times New Roman"/>
+        </w:rPr>
+      </w:pPr>
+      <w:r>
+        <w:rPr>
+          <w:rFonts w:ascii="Times New Roman" w:hAnsi="Times New Roman" w:cs="Times New Roman"/>
+        </w:rPr>
+        <w:t>        if (a[3] != b[3]) begin</w:t>
+      </w:r>
+    </w:p>
+    <w:p>
+      <w:pPr>
+        <w:rPr>
+          <w:rFonts w:ascii="Times New Roman" w:hAnsi="Times New Roman" w:cs="Times New Roman"/>
+        </w:rPr>
+      </w:pPr>
+      <w:r>
+        <w:rPr>
+          <w:rFonts w:ascii="Times New Roman" w:hAnsi="Times New Roman" w:cs="Times New Roman"/>
+        </w:rPr>
+        <w:t>            a_greater = a[3];</w:t>
+      </w:r>
+    </w:p>
+    <w:p>
+      <w:pPr>
+        <w:rPr>
+          <w:rFonts w:ascii="Times New Roman" w:hAnsi="Times New Roman" w:cs="Times New Roman"/>
+        </w:rPr>
+      </w:pPr>
+      <w:r>
+        <w:rPr>
+          <w:rFonts w:ascii="Times New Roman" w:hAnsi="Times New Roman" w:cs="Times New Roman"/>
+        </w:rPr>
+        <w:t>            b_greater = b[3];</w:t>
+      </w:r>
+    </w:p>
+    <w:p>
+      <w:pPr>
+        <w:rPr>
+          <w:rFonts w:ascii="Times New Roman" w:hAnsi="Times New Roman" w:cs="Times New Roman"/>
+        </w:rPr>
+      </w:pPr>
+      <w:r>
+        <w:rPr>
+          <w:rFonts w:ascii="Times New Roman" w:hAnsi="Times New Roman" w:cs="Times New Roman"/>
+        </w:rPr>
+        <w:t>        end else if (a[2] != b[2]) begin</w:t>
+      </w:r>
+    </w:p>
+    <w:p>
+      <w:pPr>
+        <w:rPr>
+          <w:rFonts w:ascii="Times New Roman" w:hAnsi="Times New Roman" w:cs="Times New Roman"/>
+        </w:rPr>
+      </w:pPr>
+      <w:r>
+        <w:rPr>
+          <w:rFonts w:ascii="Times New Roman" w:hAnsi="Times New Roman" w:cs="Times New Roman"/>
+        </w:rPr>
+        <w:t>            a_greater = a[2];</w:t>
+      </w:r>
+    </w:p>
+    <w:p>
+      <w:pPr>
+        <w:rPr>
+          <w:rFonts w:ascii="Times New Roman" w:hAnsi="Times New Roman" w:cs="Times New Roman"/>
+        </w:rPr>
+      </w:pPr>
+      <w:r>
+        <w:rPr>
+          <w:rFonts w:ascii="Times New Roman" w:hAnsi="Times New Roman" w:cs="Times New Roman"/>
+        </w:rPr>
+        <w:t>            b_greater = b[2];</w:t>
+      </w:r>
+    </w:p>
+    <w:p>
+      <w:pPr>
+        <w:rPr>
+          <w:rFonts w:ascii="Times New Roman" w:hAnsi="Times New Roman" w:cs="Times New Roman"/>
+        </w:rPr>
+      </w:pPr>
+      <w:r>
+        <w:rPr>
+          <w:rFonts w:ascii="Times New Roman" w:hAnsi="Times New Roman" w:cs="Times New Roman"/>
+        </w:rPr>
+        <w:t>        end else if (a[1] != b[1]) begin</w:t>
+      </w:r>
+    </w:p>
+    <w:p>
+      <w:pPr>
+        <w:rPr>
+          <w:rFonts w:ascii="Times New Roman" w:hAnsi="Times New Roman" w:cs="Times New Roman"/>
+        </w:rPr>
+      </w:pPr>
+      <w:r>
+        <w:rPr>
+          <w:rFonts w:ascii="Times New Roman" w:hAnsi="Times New Roman" w:cs="Times New Roman"/>
+        </w:rPr>
+        <w:t>            a_greater = a[1];</w:t>
+      </w:r>
+    </w:p>
+    <w:p>
+      <w:pPr>
+        <w:rPr>
+          <w:rFonts w:ascii="Times New Roman" w:hAnsi="Times New Roman" w:cs="Times New Roman"/>
+        </w:rPr>
+      </w:pPr>
+      <w:r>
+        <w:rPr>
+          <w:rFonts w:ascii="Times New Roman" w:hAnsi="Times New Roman" w:cs="Times New Roman"/>
+        </w:rPr>
+        <w:t>            b_greater = b[1];</w:t>
+      </w:r>
+    </w:p>
+    <w:p>
+      <w:pPr>
+        <w:rPr>
+          <w:rFonts w:ascii="Times New Roman" w:hAnsi="Times New Roman" w:cs="Times New Roman"/>
+        </w:rPr>
+      </w:pPr>
+      <w:r>
+        <w:rPr>
+          <w:rFonts w:ascii="Times New Roman" w:hAnsi="Times New Roman" w:cs="Times New Roman"/>
+        </w:rPr>
+        <w:lastRenderedPageBreak/>
+        <w:t>        end else if (a[0] != b[0]) begin</w:t>
+      </w:r>
+    </w:p>
+    <w:p>
+      <w:pPr>
+        <w:rPr>
+          <w:rFonts w:ascii="Times New Roman" w:hAnsi="Times New Roman" w:cs="Times New Roman"/>
+        </w:rPr>
+      </w:pPr>
+      <w:r>
+        <w:rPr>
+          <w:rFonts w:ascii="Times New Roman" w:hAnsi="Times New Roman" w:cs="Times New Roman"/>
+        </w:rPr>
+        <w:t>            a_greater = a[0];</w:t>
+      </w:r>
+    </w:p>
+    <w:p>
+      <w:pPr>
+        <w:rPr>
+          <w:rFonts w:ascii="Times New Roman" w:hAnsi="Times New Roman" w:cs="Times New Roman"/>
+        </w:rPr>
+      </w:pPr>
+      <w:r>
+        <w:rPr>
+          <w:rFonts w:ascii="Times New Roman" w:hAnsi="Times New Roman" w:cs="Times New Roman"/>
+        </w:rPr>
+        <w:t>            b_greater = b[0];</w:t>
+      </w:r>
+    </w:p>
+    <w:p>
+      <w:pPr>
+        <w:rPr>
+          <w:rFonts w:ascii="Times New Roman" w:hAnsi="Times New Roman" w:cs="Times New Roman"/>
+        </w:rPr>
+      </w:pPr>
+      <w:r>
+        <w:rPr>
+          <w:rFonts w:ascii="Times New Roman" w:hAnsi="Times New Roman" w:cs="Times New Roman"/>
+        </w:rPr>
+        <w:t>        end else begin</w:t>
+      </w:r>
+    </w:p>
+    <w:p>
+      <w:pPr>
+        <w:rPr>
+          <w:rFonts w:ascii="Times New Roman" w:hAnsi="Times New Roman" w:cs="Times New Roman"/>
+        </w:rPr>
+      </w:pPr>
+      <w:r>
+        <w:rPr>
+          <w:rFonts w:ascii="Times New Roman" w:hAnsi="Times New Roman" w:cs="Times New Roman"/>
+        </w:rPr>
+        <w:t>            equal = 1'b1;</w:t>
+      </w:r>
+    </w:p>
+    <w:p>
+      <w:pPr>
+        <w:rPr>
+          <w:rFonts w:ascii="Times New Roman" w:hAnsi="Times New Roman" w:cs="Times New Roman"/>
+        </w:rPr>
+      </w:pPr>
+      <w:r>
+        <w:rPr>
+          <w:rFonts w:ascii="Times New Roman" w:hAnsi="Times New Roman" w:cs="Times New Roman"/>
+        </w:rPr>
+        <w:t>        end</w:t>
+      </w:r>
+    </w:p>
+    <w:p>
+      <w:pPr>
+        <w:rPr>
+          <w:rFonts w:ascii="Times New Roman" w:hAnsi="Times New Roman" w:cs="Times New Roman"/>
+        </w:rPr>
+      </w:pPr>
+      <w:r>
+        <w:rPr>
+          <w:rFonts w:ascii="Times New Roman" w:hAnsi="Times New Roman" w:cs="Times New Roman"/>
+        </w:rPr>
+        <w:t>    end</w:t>
+      </w:r>
+    </w:p>
+    <w:p>
+      <w:pPr>
+        <w:rPr>
+          <w:rFonts w:ascii="Times New Roman" w:hAnsi="Times New Roman" w:cs="Times New Roman"/>
+        </w:rPr>
+      </w:pPr>
+      <w:r>
+        <w:rPr>
+          <w:rFonts w:ascii="Times New Roman" w:hAnsi="Times New Roman" w:cs="Times New Roman"/>
+        </w:rPr>
+        <w:t>endmodule</w:t>
+      </w:r>
+    </w:p>
+    <w:p>
+      <w:pPr>
+        <w:rPr>
+          <w:rFonts w:ascii="Times New Roman" w:hAnsi="Times New Roman" w:cs="Times New Roman"/>
+        </w:rPr>
+      </w:pPr>
+    </w:p>
+    <w:p>
+      <w:pPr>
+        <w:rPr>
+          <w:rFonts w:ascii="Times New Roman" w:hAnsi="Times New Roman" w:cs="Times New Roman"/>
+          <w:b/>
+          <w:bCs/>
+        </w:rPr>
+      </w:pPr>
+      <w:r>
+        <w:rPr>
+          <w:rFonts w:ascii="Times New Roman" w:hAnsi="Times New Roman" w:cs="Times New Roman"/>
+          <w:b/>
+          <w:bCs/>
+        </w:rPr>
+        <w:t>Compilation :</w:t>
+      </w:r>
+    </w:p>
+    <w:p>
+      <w:pPr>
+        <w:rPr>
+          <w:rFonts w:ascii="Times New Roman" w:hAnsi="Times New Roman" w:cs="Times New Roman"/>
+        </w:rPr>
+      </w:pPr>
+      <w:r>
+        <w:rPr>
+          <w:rFonts w:ascii="Times New Roman" w:hAnsi="Times New Roman" w:cs="Times New Roman"/>
+        </w:rPr>
+        <w:drawing>
+          <wp:inline distT="0" distB="0" distL="0" distR="0" wp14:anchorId="271CF4FC" wp14:editId="618D7D0D">
+            <wp:extent cx="5731510" cy="3220085"/>
+            <wp:effectExtent l="0" t="0" r="2540" b="0"/>
+            <wp:docPr id="1779993696" name="Picture 1"/>
+            <wp:cNvGraphicFramePr>
+              <a:graphicFrameLocks xmlns:a="http://schemas.openxmlformats.org/drawingml/2006/main" noChangeAspect="1"/>
+            </wp:cNvGraphicFramePr>
+            <a:graphic xmlns:a="http://schemas.openxmlformats.org/drawingml/2006/main">
+              <a:graphicData uri="http://schemas.openxmlformats.org/drawingml/2006/picture">
+                <pic:pic xmlns:pic="http://schemas.openxmlformats.org/drawingml/2006/picture">
+                  <pic:nvPicPr>
+                    <pic:cNvPr id="1779993696" name=""/>
+                    <pic:cNvPicPr/>
+                  </pic:nvPicPr>
+                  <pic:blipFill>
+                    <a:blip r:embed="rId9"/>
+                    <a:stretch>
+                      <a:fillRect/>
+                    </a:stretch>
+                  </pic:blipFill>
+                  <pic:spPr>
+                    <a:xfrm>
+                      <a:off x="0" y="0"/>
+                      <a:ext cx="5731510" cy="3220085"/>
+                    </a:xfrm>
+                    <a:prstGeom prst="rect">
+                      <a:avLst/>
+                    </a:prstGeom>
+                  </pic:spPr>
+                </pic:pic>
+              </a:graphicData>
+            </a:graphic>
+          </wp:inline>
+        </w:drawing>
+      </w:r>
+    </w:p>
+    <w:p>
+      <w:pPr>
+        <w:rPr>
+          <w:rFonts w:ascii="Times New Roman" w:hAnsi="Times New Roman" w:cs="Times New Roman"/>
+        </w:rPr>
+      </w:pPr>
+    </w:p>
+    <w:p>
+      <w:pPr>
+        <w:rPr>
+          <w:rFonts w:ascii="Times New Roman" w:hAnsi="Times New Roman" w:cs="Times New Roman"/>
+        </w:rPr>
+      </w:pPr>
+    </w:p>
+    <w:p>
+      <w:pPr>
+        <w:rPr>
+          <w:rFonts w:ascii="Times New Roman" w:hAnsi="Times New Roman" w:cs="Times New Roman"/>
+          <w:b/>
+          <w:bCs/>
+        </w:rPr>
+      </w:pPr>
+    </w:p>
+    <w:p>
+      <w:pPr>
+        <w:rPr>
+          <w:rFonts w:ascii="Times New Roman" w:hAnsi="Times New Roman" w:cs="Times New Roman"/>
+          <w:b/>
+          <w:bCs/>
+        </w:rPr>
+      </w:pPr>
+    </w:p>
+    <w:p>
+      <w:pPr>
+        <w:rPr>
+          <w:rFonts w:ascii="Times New Roman" w:hAnsi="Times New Roman" w:cs="Times New Roman"/>
+          <w:b/>
+          <w:bCs/>
+        </w:rPr>
+      </w:pPr>
+    </w:p>
+    <w:p>
+      <w:pPr>
+        <w:rPr>
+          <w:rFonts w:ascii="Times New Roman" w:hAnsi="Times New Roman" w:cs="Times New Roman"/>
+          <w:b/>
+          <w:bCs/>
+        </w:rPr>
+      </w:pPr>
+    </w:p>
+    <w:p>
+      <w:pPr>
+        <w:rPr>
+          <w:rFonts w:ascii="Times New Roman" w:hAnsi="Times New Roman" w:cs="Times New Roman"/>
+          <w:b/>
+          <w:bCs/>
+        </w:rPr>
+      </w:pPr>
+    </w:p>
+    <w:p>
+      <w:pPr>
+        <w:rPr>
+          <w:rFonts w:ascii="Times New Roman" w:hAnsi="Times New Roman" w:cs="Times New Roman"/>
+          <w:b/>
+          <w:bCs/>
+        </w:rPr>
+      </w:pPr>
+    </w:p>
+    <w:p>
+      <w:pPr>
+        <w:rPr>
+          <w:rFonts w:ascii="Times New Roman" w:hAnsi="Times New Roman" w:cs="Times New Roman"/>
+        </w:rPr>
+      </w:pPr>
+      <w:r>
+        <w:rPr>
+          <w:rFonts w:ascii="Times New Roman" w:hAnsi="Times New Roman" w:cs="Times New Roman"/>
+          <w:b/>
+          <w:bCs/>
+        </w:rPr>
+        <w:lastRenderedPageBreak/>
+        <w:t>Simulation :</w:t>
+      </w:r>
+      <w:r>
+        <w:rPr>
+          <w:rFonts w:ascii="Times New Roman" w:hAnsi="Times New Roman" w:cs="Times New Roman"/>
+        </w:rPr>
+        <w:t xml:space="preserve"> 4</w:t>
+      </w:r>
+      <w:r>
+        <w:rPr>
+          <w:rFonts w:ascii="Times New Roman" w:hAnsi="Times New Roman" w:cs="Times New Roman"/>
+        </w:rPr>
+        <w:t>-</w:t>
+      </w:r>
+      <w:r>
+        <w:rPr>
+          <w:rFonts w:ascii="Times New Roman" w:hAnsi="Times New Roman" w:cs="Times New Roman"/>
+        </w:rPr>
+        <w:t xml:space="preserve">bit Comparator </w:t>
+      </w:r>
+    </w:p>
+    <w:p>
+      <w:pPr>
+        <w:rPr>
+          <w:rFonts w:ascii="Times New Roman" w:hAnsi="Times New Roman" w:cs="Times New Roman"/>
+        </w:rPr>
+      </w:pPr>
+      <w:r>
+        <w:rPr>
+          <w:rFonts w:ascii="Times New Roman" w:hAnsi="Times New Roman" w:cs="Times New Roman"/>
+        </w:rPr>
+        <w:drawing>
+          <wp:inline distT="0" distB="0" distL="0" distR="0" wp14:anchorId="606DE55A" wp14:editId="3346D16D">
+            <wp:extent cx="5731510" cy="3220085"/>
+            <wp:effectExtent l="0" t="0" r="2540" b="0"/>
+            <wp:docPr id="8325108" name="Picture 1"/>
+            <wp:cNvGraphicFramePr>
+              <a:graphicFrameLocks xmlns:a="http://schemas.openxmlformats.org/drawingml/2006/main" noChangeAspect="1"/>
+            </wp:cNvGraphicFramePr>
+            <a:graphic xmlns:a="http://schemas.openxmlformats.org/drawingml/2006/main">
+              <a:graphicData uri="http://schemas.openxmlformats.org/drawingml/2006/picture">
+                <pic:pic xmlns:pic="http://schemas.openxmlformats.org/drawingml/2006/picture">
+                  <pic:nvPicPr>
+                    <pic:cNvPr id="8325108" name=""/>
+                    <pic:cNvPicPr/>
+                  </pic:nvPicPr>
+                  <pic:blipFill>
+                    <a:blip r:embed="rId10"/>
+                    <a:stretch>
+                      <a:fillRect/>
+                    </a:stretch>
+                  </pic:blipFill>
+                  <pic:spPr>
+                    <a:xfrm>
+                      <a:off x="0" y="0"/>
+                      <a:ext cx="5731510" cy="3220085"/>
+                    </a:xfrm>
+                    <a:prstGeom prst="rect">
+                      <a:avLst/>
+                    </a:prstGeom>
+                  </pic:spPr>
+                </pic:pic>
+              </a:graphicData>
+            </a:graphic>
+          </wp:inline>
+        </w:drawing>
+      </w:r>
+    </w:p>
+    <w:p>
+      <w:pPr>
+        <w:rPr>
+          <w:rFonts w:ascii="Times New Roman" w:hAnsi="Times New Roman" w:cs="Times New Roman"/>
+        </w:rPr>
+      </w:pPr>
+    </w:p>
+    <w:p>
+      <w:pPr>
+        <w:rPr>
+          <w:rFonts w:ascii="Times New Roman" w:hAnsi="Times New Roman" w:cs="Times New Roman"/>
+        </w:rPr>
+      </w:pPr>
+      <w:r>
+        <w:rPr>
+          <w:rFonts w:ascii="Times New Roman" w:hAnsi="Times New Roman" w:cs="Times New Roman"/>
+        </w:rPr>
+        <w:drawing>
+          <wp:inline distT="0" distB="0" distL="0" distR="0" wp14:anchorId="1D792815" wp14:editId="10541A26">
+            <wp:extent cx="5731510" cy="3220085"/>
+            <wp:effectExtent l="0" t="0" r="2540" b="0"/>
+            <wp:docPr id="221040019" name="Picture 1"/>
+            <wp:cNvGraphicFramePr>
+              <a:graphicFrameLocks xmlns:a="http://schemas.openxmlformats.org/drawingml/2006/main" noChangeAspect="1"/>
+            </wp:cNvGraphicFramePr>
+            <a:graphic xmlns:a="http://schemas.openxmlformats.org/drawingml/2006/main">
+              <a:graphicData uri="http://schemas.openxmlformats.org/drawingml/2006/picture">
+                <pic:pic xmlns:pic="http://schemas.openxmlformats.org/drawingml/2006/picture">
+                  <pic:nvPicPr>
+                    <pic:cNvPr id="221040019" name=""/>
+                    <pic:cNvPicPr/>
+                  </pic:nvPicPr>
+                  <pic:blipFill>
+                    <a:blip r:embed="rId11"/>
+                    <a:stretch>
+                      <a:fillRect/>
+                    </a:stretch>
+                  </pic:blipFill>
+                  <pic:spPr>
+                    <a:xfrm>
+                      <a:off x="0" y="0"/>
+                      <a:ext cx="5731510" cy="3220085"/>
+                    </a:xfrm>
+                    <a:prstGeom prst="rect">
+                      <a:avLst/>
+                    </a:prstGeom>
+                  </pic:spPr>
+                </pic:pic>
+              </a:graphicData>
+            </a:graphic>
+          </wp:inline>
+        </w:drawing>
+      </w:r>
+    </w:p>
+    <w:p>
+      <w:pPr>
+        <w:rPr>
+          <w:rFonts w:ascii="Times New Roman" w:hAnsi="Times New Roman" w:cs="Times New Roman"/>
+        </w:rPr>
+      </w:pPr>
+    </w:p>
+    <w:p>
+      <w:pPr>
+        <w:rPr>
+          <w:rFonts w:ascii="Times New Roman" w:hAnsi="Times New Roman" w:cs="Times New Roman"/>
+        </w:rPr>
+      </w:pPr>
+    </w:p>
+    <w:p>
+      <w:pPr>
+        <w:rPr>
+          <w:rFonts w:ascii="Times New Roman" w:hAnsi="Times New Roman" w:cs="Times New Roman"/>
+        </w:rPr>
+      </w:pPr>
+    </w:p>
+    <w:p>
+      <w:pPr>
+        <w:rPr>
+          <w:rFonts w:ascii="Times New Roman" w:hAnsi="Times New Roman" w:cs="Times New Roman"/>
+        </w:rPr>
+      </w:pPr>
+    </w:p>
+    <w:p>
+      <w:pPr>
+        <w:rPr>
+          <w:rFonts w:ascii="Times New Roman" w:hAnsi="Times New Roman" w:cs="Times New Roman"/>
+        </w:rPr>
+      </w:pPr>
+    </w:p>
+    <w:p>
+      <w:pPr>
+        <w:rPr>
+          <w:rFonts w:ascii="Times New Roman" w:hAnsi="Times New Roman" w:cs="Times New Roman"/>
+          <w:b/>
+          <w:bCs/>
+        </w:rPr>
+      </w:pPr>
+      <w:r>
+        <w:rPr>
+          <w:rFonts w:ascii="Times New Roman" w:hAnsi="Times New Roman" w:cs="Times New Roman"/>
+          <w:b/>
+          <w:bCs/>
+        </w:rPr>
+        <w:lastRenderedPageBreak/>
+        <w:t>3</w:t>
+      </w:r>
+      <w:r>
+        <w:rPr>
+          <w:rFonts w:ascii="Times New Roman" w:hAnsi="Times New Roman" w:cs="Times New Roman"/>
+          <w:b/>
+          <w:bCs/>
+        </w:rPr>
+        <w:t>-bit</w:t>
+      </w:r>
+      <w:r>
+        <w:rPr>
+          <w:rFonts w:ascii="Times New Roman" w:hAnsi="Times New Roman" w:cs="Times New Roman"/>
+          <w:b/>
+          <w:bCs/>
+        </w:rPr>
+        <w:t xml:space="preserve"> Binary to Gray Converter :</w:t>
+      </w:r>
+    </w:p>
+    <w:p>
+      <w:pPr>
+        <w:rPr>
+          <w:rFonts w:ascii="Times New Roman" w:hAnsi="Times New Roman" w:cs="Times New Roman"/>
+        </w:rPr>
+      </w:pPr>
+      <w:r>
+        <w:rPr>
+          <w:rFonts w:ascii="Times New Roman" w:hAnsi="Times New Roman" w:cs="Times New Roman"/>
+        </w:rPr>
+        <w:t>Verilog Code :</w:t>
+      </w:r>
+    </w:p>
+    <w:p>
+      <w:pPr>
+        <w:rPr>
+          <w:rFonts w:ascii="Times New Roman" w:hAnsi="Times New Roman" w:cs="Times New Roman"/>
+        </w:rPr>
+      </w:pPr>
+      <w:r>
+        <w:rPr>
+          <w:rFonts w:ascii="Times New Roman" w:hAnsi="Times New Roman" w:cs="Times New Roman"/>
+        </w:rPr>
+        <w:t xml:space="preserve">module </w:t>
+      </w:r>
+      <w:proofErr w:type="spellStart"/>
+      <w:r>
+        <w:rPr>
+          <w:rFonts w:ascii="Times New Roman" w:hAnsi="Times New Roman" w:cs="Times New Roman"/>
+        </w:rPr>
+        <w:t>binary_to_gray</w:t>
+      </w:r>
+      <w:proofErr w:type="spellEnd"/>
+      <w:r>
+        <w:rPr>
+          <w:rFonts w:ascii="Times New Roman" w:hAnsi="Times New Roman" w:cs="Times New Roman"/>
+        </w:rPr>
+        <w:t xml:space="preserve"> (</w:t>
+      </w:r>
+    </w:p>
+    <w:p>
+      <w:pPr>
+        <w:rPr>
+          <w:rFonts w:ascii="Times New Roman" w:hAnsi="Times New Roman" w:cs="Times New Roman"/>
+        </w:rPr>
+      </w:pPr>
+      <w:r>
+        <w:rPr>
+          <w:rFonts w:ascii="Times New Roman" w:hAnsi="Times New Roman" w:cs="Times New Roman"/>
+        </w:rPr>
+        <w:t>    input  [3:0] binary,</w:t>
+      </w:r>
+    </w:p>
+    <w:p>
+      <w:pPr>
+        <w:rPr>
+          <w:rFonts w:ascii="Times New Roman" w:hAnsi="Times New Roman" w:cs="Times New Roman"/>
+        </w:rPr>
+      </w:pPr>
+      <w:r>
+        <w:rPr>
+          <w:rFonts w:ascii="Times New Roman" w:hAnsi="Times New Roman" w:cs="Times New Roman"/>
+        </w:rPr>
+        <w:t xml:space="preserve">    output [3:0] </w:t>
+      </w:r>
+      <w:proofErr w:type="spellStart"/>
+      <w:r>
+        <w:rPr>
+          <w:rFonts w:ascii="Times New Roman" w:hAnsi="Times New Roman" w:cs="Times New Roman"/>
+        </w:rPr>
+        <w:t>gray</w:t>
+      </w:r>
+      <w:proofErr w:type="spellEnd"/>
+    </w:p>
+    <w:p>
+      <w:pPr>
+        <w:rPr>
+          <w:rFonts w:ascii="Times New Roman" w:hAnsi="Times New Roman" w:cs="Times New Roman"/>
+        </w:rPr>
+      </w:pPr>
+      <w:r>
+        <w:rPr>
+          <w:rFonts w:ascii="Times New Roman" w:hAnsi="Times New Roman" w:cs="Times New Roman"/>
+        </w:rPr>
+        <w:t>);</w:t>
+      </w:r>
+    </w:p>
+    <w:p>
+      <w:pPr>
+        <w:rPr>
+          <w:rFonts w:ascii="Times New Roman" w:hAnsi="Times New Roman" w:cs="Times New Roman"/>
+        </w:rPr>
+      </w:pPr>
+    </w:p>
+    <w:p>
+      <w:pPr>
+        <w:rPr>
+          <w:rFonts w:ascii="Times New Roman" w:hAnsi="Times New Roman" w:cs="Times New Roman"/>
+        </w:rPr>
+      </w:pPr>
+      <w:r>
+        <w:rPr>
+          <w:rFonts w:ascii="Times New Roman" w:hAnsi="Times New Roman" w:cs="Times New Roman"/>
+        </w:rPr>
+        <w:t xml:space="preserve">    assign </w:t>
+      </w:r>
+      <w:proofErr w:type="spellStart"/>
+      <w:r>
+        <w:rPr>
+          <w:rFonts w:ascii="Times New Roman" w:hAnsi="Times New Roman" w:cs="Times New Roman"/>
+        </w:rPr>
+        <w:t>gray</w:t>
+      </w:r>
+      <w:proofErr w:type="spellEnd"/>
+      <w:r>
+        <w:rPr>
+          <w:rFonts w:ascii="Times New Roman" w:hAnsi="Times New Roman" w:cs="Times New Roman"/>
+        </w:rPr>
+        <w:t>[3] = binary[3];</w:t>
+      </w:r>
+    </w:p>
+    <w:p>
+      <w:pPr>
+        <w:rPr>
+          <w:rFonts w:ascii="Times New Roman" w:hAnsi="Times New Roman" w:cs="Times New Roman"/>
+        </w:rPr>
+      </w:pPr>
+      <w:r>
+        <w:rPr>
+          <w:rFonts w:ascii="Times New Roman" w:hAnsi="Times New Roman" w:cs="Times New Roman"/>
+        </w:rPr>
+        <w:t xml:space="preserve">    assign </w:t>
+      </w:r>
+      <w:proofErr w:type="spellStart"/>
+      <w:r>
+        <w:rPr>
+          <w:rFonts w:ascii="Times New Roman" w:hAnsi="Times New Roman" w:cs="Times New Roman"/>
+        </w:rPr>
+        <w:t>gray</w:t>
+      </w:r>
+      <w:proofErr w:type="spellEnd"/>
+      <w:r>
+        <w:rPr>
+          <w:rFonts w:ascii="Times New Roman" w:hAnsi="Times New Roman" w:cs="Times New Roman"/>
+        </w:rPr>
+        <w:t>[2] = binary[3] ^ binary[2];</w:t>
+      </w:r>
+    </w:p>
+    <w:p>
+      <w:pPr>
+        <w:rPr>
+          <w:rFonts w:ascii="Times New Roman" w:hAnsi="Times New Roman" w:cs="Times New Roman"/>
+        </w:rPr>
+      </w:pPr>
+      <w:r>
+        <w:rPr>
+          <w:rFonts w:ascii="Times New Roman" w:hAnsi="Times New Roman" w:cs="Times New Roman"/>
+        </w:rPr>
+        <w:t xml:space="preserve">    assign </w:t>
+      </w:r>
+      <w:proofErr w:type="spellStart"/>
+      <w:r>
+        <w:rPr>
+          <w:rFonts w:ascii="Times New Roman" w:hAnsi="Times New Roman" w:cs="Times New Roman"/>
+        </w:rPr>
+        <w:t>gray</w:t>
+      </w:r>
+      <w:proofErr w:type="spellEnd"/>
+      <w:r>
+        <w:rPr>
+          <w:rFonts w:ascii="Times New Roman" w:hAnsi="Times New Roman" w:cs="Times New Roman"/>
+        </w:rPr>
+        <w:t>[1] = binary[2] ^ binary[1];</w:t>
+      </w:r>
+    </w:p>
+    <w:p>
+      <w:pPr>
+        <w:rPr>
+          <w:rFonts w:ascii="Times New Roman" w:hAnsi="Times New Roman" w:cs="Times New Roman"/>
+        </w:rPr>
+      </w:pPr>
+      <w:r>
+        <w:rPr>
+          <w:rFonts w:ascii="Times New Roman" w:hAnsi="Times New Roman" w:cs="Times New Roman"/>
+        </w:rPr>
+        <w:t xml:space="preserve">    assign </w:t>
+      </w:r>
+      <w:proofErr w:type="spellStart"/>
+      <w:r>
+        <w:rPr>
+          <w:rFonts w:ascii="Times New Roman" w:hAnsi="Times New Roman" w:cs="Times New Roman"/>
+        </w:rPr>
+        <w:t>gray</w:t>
+      </w:r>
+      <w:proofErr w:type="spellEnd"/>
+      <w:r>
+        <w:rPr>
+          <w:rFonts w:ascii="Times New Roman" w:hAnsi="Times New Roman" w:cs="Times New Roman"/>
+        </w:rPr>
+        <w:t>[0] = binary[1] ^ binary[0];</w:t>
+      </w:r>
+    </w:p>
+    <w:p>
+      <w:pPr>
+        <w:rPr>
+          <w:rFonts w:ascii="Times New Roman" w:hAnsi="Times New Roman" w:cs="Times New Roman"/>
+        </w:rPr>
+      </w:pPr>
+    </w:p>
+    <w:p>
+      <w:pPr>
+        <w:rPr>
+          <w:rFonts w:ascii="Times New Roman" w:hAnsi="Times New Roman" w:cs="Times New Roman"/>
+        </w:rPr>
+      </w:pPr>
+      <w:r>
+        <w:rPr>
+          <w:rFonts w:ascii="Times New Roman" w:hAnsi="Times New Roman" w:cs="Times New Roman"/>
+        </w:rPr>
+        <w:t>endmodule</w:t>
+      </w:r>
+    </w:p>
+    <w:p>
+      <w:pPr>
+        <w:rPr>
+          <w:rFonts w:ascii="Times New Roman" w:hAnsi="Times New Roman" w:cs="Times New Roman"/>
+        </w:rPr>
+      </w:pPr>
+    </w:p>
+    <w:p>
+      <w:pPr>
+        <w:rPr>
+          <w:rFonts w:ascii="Times New Roman" w:hAnsi="Times New Roman" w:cs="Times New Roman"/>
+          <w:b/>
+          <w:bCs/>
+        </w:rPr>
+      </w:pPr>
+      <w:r>
+        <w:rPr>
+          <w:rFonts w:ascii="Times New Roman" w:hAnsi="Times New Roman" w:cs="Times New Roman"/>
+          <w:b/>
+          <w:bCs/>
+        </w:rPr>
+        <w:t>Compilation :</w:t>
+      </w:r>
+    </w:p>
+    <w:p>
+      <w:pPr>
+        <w:rPr>
+          <w:rFonts w:ascii="Times New Roman" w:hAnsi="Times New Roman" w:cs="Times New Roman"/>
+        </w:rPr>
+      </w:pPr>
+      <w:r>
+        <w:rPr>
+          <w:noProof/>
+        </w:rPr>
+        <w:drawing>
+          <wp:inline distT="0" distB="0" distL="0" distR="0" wp14:anchorId="322011C2" wp14:editId="7E4B4BFF">
+            <wp:extent cx="5731510" cy="3220085"/>
+            <wp:effectExtent l="0" t="0" r="2540" b="0"/>
+            <wp:docPr id="1661306251" name="Picture 1"/>
+            <wp:cNvGraphicFramePr>
+              <a:graphicFrameLocks xmlns:a="http://schemas.openxmlformats.org/drawingml/2006/main" noChangeAspect="1"/>
+            </wp:cNvGraphicFramePr>
+            <a:graphic xmlns:a="http://schemas.openxmlformats.org/drawingml/2006/main">
+              <a:graphicData uri="http://schemas.openxmlformats.org/drawingml/2006/picture">
+                <pic:pic xmlns:pic="http://schemas.openxmlformats.org/drawingml/2006/picture">
+                  <pic:nvPicPr>
+                    <pic:cNvPr id="0" name="Picture 1"/>
+                    <pic:cNvPicPr>
+                      <a:picLocks noChangeAspect="1" noChangeArrowheads="1"/>
+                    </pic:cNvPicPr>
+                  </pic:nvPicPr>
+                  <pic:blipFill>
+                    <a:blip r:embed="rId12" cstate="print">
+                      <a:extLst>
+                        <a:ext uri="{28A0092B-C50C-407E-A947-70E740481C1C}">
+                          <a14:useLocalDpi xmlns:a14="http://schemas.microsoft.com/office/drawing/2010/main" val="0"/>
+                        </a:ext>
+                      </a:extLst>
+                    </a:blip>
+                    <a:srcRect/>
+                    <a:stretch>
+                      <a:fillRect/>
+                    </a:stretch>
+                  </pic:blipFill>
+                  <pic:spPr bwMode="auto">
+                    <a:xfrm>
+                      <a:off x="0" y="0"/>
+                      <a:ext cx="5731510" cy="3220085"/>
+                    </a:xfrm>
+                    <a:prstGeom prst="rect">
+                      <a:avLst/>
+                    </a:prstGeom>
+                    <a:noFill/>
+                    <a:ln>
+                      <a:noFill/>
+                    </a:ln>
+                  </pic:spPr>
+                </pic:pic>
+              </a:graphicData>
+            </a:graphic>
+          </wp:inline>
+        </w:drawing>
+      </w:r>
+    </w:p>
+    <w:p>
+      <w:pPr>
+        <w:rPr>
+          <w:rFonts w:ascii="Times New Roman" w:hAnsi="Times New Roman" w:cs="Times New Roman"/>
+        </w:rPr>
+      </w:pPr>
+    </w:p>
+    <w:p>
+      <w:pPr>
+        <w:rPr>
+          <w:rFonts w:ascii="Times New Roman" w:hAnsi="Times New Roman" w:cs="Times New Roman"/>
+        </w:rPr>
+      </w:pPr>
+    </w:p>
+    <w:p>
+      <w:pPr>
+        <w:rPr>
+          <w:rFonts w:ascii="Times New Roman" w:hAnsi="Times New Roman" w:cs="Times New Roman"/>
+        </w:rPr>
+      </w:pPr>
+    </w:p>
+    <w:p>
+      <w:pPr>
+        <w:rPr>
+          <w:rFonts w:ascii="Times New Roman" w:hAnsi="Times New Roman" w:cs="Times New Roman"/>
+          <w:b/>
+          <w:bCs/>
+        </w:rPr>
+      </w:pPr>
+      <w:r>
+        <w:rPr>
+          <w:rFonts w:ascii="Times New Roman" w:hAnsi="Times New Roman" w:cs="Times New Roman"/>
+          <w:b/>
+          <w:bCs/>
+        </w:rPr>
+        <w:lastRenderedPageBreak/>
+        <w:t>Simulation :</w:t>
+      </w:r>
+    </w:p>
+    <w:p>
+      <w:pPr>
+        <w:rPr>
+          <w:rFonts w:ascii="Times New Roman" w:hAnsi="Times New Roman" w:cs="Times New Roman"/>
+        </w:rPr>
+      </w:pPr>
+      <w:r>
+        <w:rPr>
+          <w:noProof/>
+        </w:rPr>
+        <w:drawing>
+          <wp:inline distT="0" distB="0" distL="0" distR="0" wp14:anchorId="0F979021" wp14:editId="15A404DF">
+            <wp:extent cx="5731510" cy="3220085"/>
+            <wp:effectExtent l="0" t="0" r="2540" b="0"/>
+            <wp:docPr id="2060633267" name="Picture 2"/>
+            <wp:cNvGraphicFramePr>
+              <a:graphicFrameLocks xmlns:a="http://schemas.openxmlformats.org/drawingml/2006/main" noChangeAspect="1"/>
+            </wp:cNvGraphicFramePr>
+            <a:graphic xmlns:a="http://schemas.openxmlformats.org/drawingml/2006/main">
+              <a:graphicData uri="http://schemas.openxmlformats.org/drawingml/2006/picture">
+                <pic:pic xmlns:pic="http://schemas.openxmlformats.org/drawingml/2006/picture">
+                  <pic:nvPicPr>
+                    <pic:cNvPr id="0" name="Picture 3"/>
+                    <pic:cNvPicPr>
+                      <a:picLocks noChangeAspect="1" noChangeArrowheads="1"/>
+                    </pic:cNvPicPr>
+                  </pic:nvPicPr>
+                  <pic:blipFill>
+                    <a:blip r:embed="rId13" cstate="print">
+                      <a:extLst>
+                        <a:ext uri="{28A0092B-C50C-407E-A947-70E740481C1C}">
+                          <a14:useLocalDpi xmlns:a14="http://schemas.microsoft.com/office/drawing/2010/main" val="0"/>
+                        </a:ext>
+                      </a:extLst>
+                    </a:blip>
+                    <a:srcRect/>
+                    <a:stretch>
+                      <a:fillRect/>
+                    </a:stretch>
+                  </pic:blipFill>
+                  <pic:spPr bwMode="auto">
+                    <a:xfrm>
+                      <a:off x="0" y="0"/>
+                      <a:ext cx="5731510" cy="3220085"/>
+                    </a:xfrm>
+                    <a:prstGeom prst="rect">
+                      <a:avLst/>
+                    </a:prstGeom>
+                    <a:noFill/>
+                    <a:ln>
+                      <a:noFill/>
+                    </a:ln>
+                  </pic:spPr>
+                </pic:pic>
+              </a:graphicData>
+            </a:graphic>
+          </wp:inline>
+        </w:drawing>
+      </w:r>
+    </w:p>
+    <w:p>
+      <w:pPr>
+        <w:rPr>
+          <w:rFonts w:ascii="Times New Roman" w:hAnsi="Times New Roman" w:cs="Times New Roman"/>
+        </w:rPr>
+      </w:pPr>
+    </w:p>
+    <w:p>
+      <w:pPr>
+        <w:rPr>
+          <w:rFonts w:ascii="Times New Roman" w:hAnsi="Times New Roman" w:cs="Times New Roman"/>
+        </w:rPr>
+      </w:pPr>
+    </w:p>
+    <w:p>
+      <w:pPr>
+        <w:rPr>
+          <w:rFonts w:ascii="Times New Roman" w:hAnsi="Times New Roman" w:cs="Times New Roman"/>
+        </w:rPr>
+      </w:pPr>
+    </w:p>
+    <w:p>
+      <w:pPr>
+        <w:rPr>
+          <w:rFonts w:ascii="Times New Roman" w:hAnsi="Times New Roman" w:cs="Times New Roman"/>
+        </w:rPr>
+      </w:pPr>
+    </w:p>
+    <w:p>
+      <w:pPr>
+        <w:rPr>
+          <w:rFonts w:ascii="Times New Roman" w:hAnsi="Times New Roman" w:cs="Times New Roman"/>
+        </w:rPr>
+      </w:pPr>
+    </w:p>
     <w:sectPr>
       <w:pgSz w:w="11906" w:h="16838"/>
       <w:pgMar w:top="1440" w:right="1440" w:bottom="1440" w:left="1440" w:header="708" w:footer="708" w:gutter="0"/>
@@ -304,8 +1905,8 @@
   <w:abstractNum w:abstractNumId="0" w15:restartNumberingAfterBreak="0">
     <w:nsid w:val="7A6E2F94"/>
     <w:multiLevelType w:val="hybridMultilevel"/>
-    <w:tmpl w:val="3CBC76DE"/>
-    <w:lvl w:ilvl="0" w:tplc="4009000F">
+    <w:tmpl w:val="61C40EE0"/>
+    <w:lvl w:ilvl="0" w:tplc="EF8C7266">
       <w:start w:val="1"/>
       <w:numFmt w:val="decimal"/>
       <w:lvlText w:val="%1."/>
@@ -314,7 +1915,7 @@
         <w:ind w:left="720" w:hanging="360"/>
       </w:pPr>
       <w:rPr>
-        <w:rFonts w:hint="default"/>
+        <w:rFonts w:asciiTheme="minorHAnsi" w:eastAsiaTheme="minorHAnsi" w:hAnsiTheme="minorHAnsi" w:cstheme="minorBidi"/>
       </w:rPr>
     </w:lvl>
     <w:lvl w:ilvl="1" w:tplc="40090019" w:tentative="1">
@@ -1312,6 +2913,29 @@
       <w:spacing w:val="5"/>
     </w:rPr>
   </w:style>
+  <w:style w:type="character" w:styleId="Hyperlink">
+    <w:name w:val="Hyperlink"/>
+    <w:basedOn w:val="DefaultParagraphFont"/>
+    <w:uiPriority w:val="99"/>
+    <w:unhideWhenUsed/>
+    <w:rsid w:val="008561FA"/>
+    <w:rPr>
+      <w:color w:val="0563C1" w:themeColor="hyperlink"/>
+      <w:u w:val="single"/>
+    </w:rPr>
+  </w:style>
+  <w:style w:type="character" w:styleId="UnresolvedMention">
+    <w:name w:val="Unresolved Mention"/>
+    <w:basedOn w:val="DefaultParagraphFont"/>
+    <w:uiPriority w:val="99"/>
+    <w:semiHidden/>
+    <w:unhideWhenUsed/>
+    <w:rsid w:val="008561FA"/>
+    <w:rPr>
+      <w:color w:val="605E5C"/>
+      <w:shd w:val="clear" w:color="auto" w:fill="E1DFDD"/>
+    </w:rPr>
+  </w:style>
 </w:styles>
 </file>
 

</xml_diff>